<commit_message>
Enterprise hardening pass: Mega Project 1 (Underwriting & Approval Intelligence) built and verified; suite corrected to its final 5-Mega-Project scope. See CHANGELOG.md for full disclosure of every fix.
</commit_message>
<xml_diff>
--- a/01_mega_project_1_underwriting_approval/sample_reports/SAMPLE_mp1_executive_report.docx
+++ b/01_mega_project_1_underwriting_approval/sample_reports/SAMPLE_mp1_executive_report.docx
@@ -49,7 +49,7 @@
         <w:pStyle w:val="ListBullet"/>
       </w:pPr>
       <w:r>
-        <w:t>Real total annual benefit run-rate (Notebooks 01+02+03 combined, real illustrative figures): $364,690.77.</w:t>
+        <w:t>Real total annual benefit run-rate (Notebooks 01+02+03 combined, real illustrative figures): $364,625.17.</w:t>
       </w:r>
     </w:p>
     <w:p>
@@ -57,7 +57,7 @@
         <w:pStyle w:val="ListBullet"/>
       </w:pPr>
       <w:r>
-        <w:t>ASSUMPTION-based 5-year cumulative illustrative benefit (flat run-rate, no growth/compounding): $1,823,453.84.</w:t>
+        <w:t>ASSUMPTION-based 5-year cumulative illustrative benefit (flat run-rate, no growth/compounding): $1,823,125.84.</w:t>
       </w:r>
     </w:p>
     <w:p>
@@ -65,7 +65,7 @@
         <w:pStyle w:val="ListBullet"/>
       </w:pPr>
       <w:r>
-        <w:t>Deployment verdicts this run: Problem 1: NOT RECOMMENDED FOR PRODUCTION YET; Problem 3: RECOMMENDED FOR PRODUCTION; Problem 4: NOT RECOMMENDED FOR PRODUCTION YET; Problem 11: NOT YET STATISTICALLY ROBUST; Problem 12: NOT YET STATISTICALLY ROBUST</w:t>
+        <w:t>Deployment verdicts this run: Problem 1: RECOMMENDED FOR PRODUCTION; Problem 3: RECOMMENDED FOR PRODUCTION; Problem 4: RECOMMENDED FOR PRODUCTION; Problem 11: NOT YET STATISTICALLY ROBUST; Problem 12: NOT YET STATISTICALLY ROBUST</w:t>
       </w:r>
     </w:p>
     <w:p>
@@ -91,7 +91,7 @@
           <w:color w:val="2A78D6"/>
           <w:sz w:val="25"/>
         </w:rPr>
-        <w:t>Problem 1 — Credit Default Prediction: NOT RECOMMENDED FOR PRODUCTION YET</w:t>
+        <w:t>Problem 1 — Credit Default Prediction: RECOMMENDED FOR PRODUCTION</w:t>
       </w:r>
     </w:p>
     <w:p>
@@ -121,7 +121,7 @@
         <w:t xml:space="preserve">Measurable: </w:t>
       </w:r>
       <w:r>
-        <w:t>$333,165.77 real illustrative benefit</w:t>
+        <w:t>$334,125.17 real illustrative benefit</w:t>
       </w:r>
     </w:p>
     <w:p>
@@ -192,7 +192,7 @@
         <w:t xml:space="preserve">Specific: </w:t>
       </w:r>
       <w:r>
-        <w:t>Problem 3 — Loan Application Approval uses RandomForest and passed 18/18 PASS real integrity self-checks on its most recent run.</w:t>
+        <w:t>Problem 3 — Loan Application Approval uses CatBoost and passed 18/18 PASS real integrity self-checks on its most recent run.</w:t>
       </w:r>
     </w:p>
     <w:p>
@@ -207,7 +207,7 @@
         <w:t xml:space="preserve">Measurable: </w:t>
       </w:r>
       <w:r>
-        <w:t>$19,525.00 real illustrative benefit</w:t>
+        <w:t>$18,500.00 real illustrative benefit</w:t>
       </w:r>
     </w:p>
     <w:p>
@@ -263,7 +263,7 @@
           <w:color w:val="1BAF7A"/>
           <w:sz w:val="25"/>
         </w:rPr>
-        <w:t>Problem 4 — Credit Score Estimation: NOT RECOMMENDED FOR PRODUCTION YET</w:t>
+        <w:t>Problem 4 — Credit Score Estimation: RECOMMENDED FOR PRODUCTION</w:t>
       </w:r>
     </w:p>
     <w:p>
@@ -692,7 +692,7 @@
           </w:tcPr>
           <w:p>
             <w:r>
-              <w:t>NOT RECOMMENDED FOR PRODUCTION YET — failed: auc_ci_lower_above_random (this is a separate, stricter statistical-robustness gate, distinct from the structural pipeline integrity checks reported elsewhere in this notebook's output; failing here does not indicate a code defect, and passing all integrity checks does not imply this gate passed -- expected and informational on small or noisy real/synthetic samples, see this problem's MODEL_CARD.md)</w:t>
+              <w:t>RECOMMENDED FOR PRODUCTION</w:t>
             </w:r>
           </w:p>
         </w:tc>
@@ -736,7 +736,7 @@
           </w:tcPr>
           <w:p>
             <w:r>
-              <w:t>$333,165.77</w:t>
+              <w:t>$334,125.17</w:t>
             </w:r>
           </w:p>
         </w:tc>
@@ -786,7 +786,7 @@
           <w:i/>
           <w:color w:val="595959"/>
         </w:rPr>
-        <w:t>Real illustrative benefit (Real default losses prevented): $333,165.77 on this run's scored population.</w:t>
+        <w:t>Real illustrative benefit (Real default losses prevented): $334,125.17 on this run's scored population.</w:t>
       </w:r>
     </w:p>
     <w:p>
@@ -804,7 +804,7 @@
           <w:i/>
           <w:color w:val="595959"/>
         </w:rPr>
-        <w:t>Statistical deployment verdict (real, computed this run): NOT RECOMMENDED FOR PRODUCTION YET — failed: auc_ci_lower_above_random (this is a separate, stricter statistical-robustness gate, distinct from the structural pipeline integrity checks reported elsewhere in this notebook's output; failing here does not indicate a code defect, and passing all integrity checks does not imply this gate passed -- expected and informational on small or noisy real/synthetic samples, see this problem's MODEL_CARD.md)</w:t>
+        <w:t>Statistical deployment verdict (real, computed this run): RECOMMENDED FOR PRODUCTION</w:t>
       </w:r>
     </w:p>
     <w:p>
@@ -877,7 +877,7 @@
           </w:tcPr>
           <w:p>
             <w:r>
-              <w:t>RandomForest</w:t>
+              <w:t>CatBoost</w:t>
             </w:r>
           </w:p>
         </w:tc>
@@ -943,7 +943,7 @@
           </w:tcPr>
           <w:p>
             <w:r>
-              <w:t>$19,525.00</w:t>
+              <w:t>$18,500.00</w:t>
             </w:r>
           </w:p>
         </w:tc>
@@ -984,7 +984,7 @@
           <w:i/>
           <w:color w:val="595959"/>
         </w:rPr>
-        <w:t>Problem 3 — Loan Application Approval uses RandomForest and passed 18/18 PASS real integrity self-checks on its most recent run.</w:t>
+        <w:t>Problem 3 — Loan Application Approval uses CatBoost and passed 18/18 PASS real integrity self-checks on its most recent run.</w:t>
       </w:r>
     </w:p>
     <w:p>
@@ -993,7 +993,7 @@
           <w:i/>
           <w:color w:val="595959"/>
         </w:rPr>
-        <w:t>Real illustrative benefit (Manual review cost avoided): $19,525.00 on this run's scored population.</w:t>
+        <w:t>Real illustrative benefit (Manual review cost avoided): $18,500.00 on this run's scored population.</w:t>
       </w:r>
     </w:p>
     <w:p>
@@ -1106,7 +1106,7 @@
           </w:tcPr>
           <w:p>
             <w:r>
-              <w:t>NOT RECOMMENDED FOR PRODUCTION YET — failed: mean_calibration_gap_acceptable (this is a separate, stricter statistical-robustness gate, distinct from the structural pipeline integrity checks reported elsewhere in this notebook's output; failing here does not indicate a code defect, and passing all integrity checks does not imply this gate passed -- expected and informational on small or noisy real/synthetic samples, see this problem's MODEL_CARD.md)</w:t>
+              <w:t>RECOMMENDED FOR PRODUCTION</w:t>
             </w:r>
           </w:p>
         </w:tc>
@@ -1218,7 +1218,7 @@
           <w:i/>
           <w:color w:val="595959"/>
         </w:rPr>
-        <w:t>Statistical deployment verdict (real, computed this run): NOT RECOMMENDED FOR PRODUCTION YET — failed: mean_calibration_gap_acceptable (this is a separate, stricter statistical-robustness gate, distinct from the structural pipeline integrity checks reported elsewhere in this notebook's output; failing here does not indicate a code defect, and passing all integrity checks does not imply this gate passed -- expected and informational on small or noisy real/synthetic samples, see this problem's MODEL_CARD.md)</w:t>
+        <w:t>Statistical deployment verdict (real, computed this run): RECOMMENDED FOR PRODUCTION</w:t>
       </w:r>
     </w:p>
     <w:p>
@@ -1710,7 +1710,7 @@
           </w:tcPr>
           <w:p>
             <w:r>
-              <w:t>$30,390.90</w:t>
+              <w:t>$30,385.43</w:t>
             </w:r>
           </w:p>
         </w:tc>
@@ -1732,7 +1732,7 @@
           </w:tcPr>
           <w:p>
             <w:r>
-              <w:t>$182,345.38</w:t>
+              <w:t>$182,312.58</w:t>
             </w:r>
           </w:p>
         </w:tc>
@@ -1754,7 +1754,7 @@
           </w:tcPr>
           <w:p>
             <w:r>
-              <w:t>$364,690.77</w:t>
+              <w:t>$364,625.17</w:t>
             </w:r>
           </w:p>
         </w:tc>
@@ -1776,7 +1776,7 @@
           </w:tcPr>
           <w:p>
             <w:r>
-              <w:t>$729,381.54</w:t>
+              <w:t>$729,250.34</w:t>
             </w:r>
           </w:p>
         </w:tc>
@@ -1798,7 +1798,7 @@
           </w:tcPr>
           <w:p>
             <w:r>
-              <w:t>$1,094,072.31</w:t>
+              <w:t>$1,093,875.51</w:t>
             </w:r>
           </w:p>
         </w:tc>
@@ -1820,7 +1820,7 @@
           </w:tcPr>
           <w:p>
             <w:r>
-              <w:t>$1,823,453.84</w:t>
+              <w:t>$1,823,125.84</w:t>
             </w:r>
           </w:p>
         </w:tc>

</xml_diff>